<commit_message>
fix buges and convert price to letter
</commit_message>
<xml_diff>
--- a/assets/AG.docx
+++ b/assets/AG.docx
@@ -1212,7 +1212,7 @@
           </mc:Choice>
           <mc:Fallback>
             <w:pict>
-              <v:shape w14:anchorId="5FAA211C" id="Text Box 28" o:spid="_x0000_s1028" type="#_x0000_t202" style="position:absolute;margin-left:-38.4pt;margin-top:342.3pt;width:266.4pt;height:25.1pt;z-index:251708416;visibility:visible;mso-wrap-style:square;mso-width-percent:0;mso-height-percent:0;mso-wrap-distance-left:9pt;mso-wrap-distance-top:0;mso-wrap-distance-right:9pt;mso-wrap-distance-bottom:0;mso-position-horizontal:absolute;mso-position-horizontal-relative:text;mso-position-vertical:absolute;mso-position-vertical-relative:text;mso-width-percent:0;mso-height-percent:0;mso-width-relative:margin;mso-height-relative:margin;v-text-anchor:top" o:gfxdata="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" fillcolor="white [3212]" stroked="f" strokeweight=".5pt">
+              <v:shape w14:anchorId="5FAA211C" id="Text Box 28" o:spid="_x0000_s1033" type="#_x0000_t202" style="position:absolute;margin-left:-38.4pt;margin-top:342.3pt;width:266.4pt;height:25.1pt;z-index:251708416;visibility:visible;mso-wrap-style:square;mso-width-percent:0;mso-height-percent:0;mso-wrap-distance-left:9pt;mso-wrap-distance-top:0;mso-wrap-distance-right:9pt;mso-wrap-distance-bottom:0;mso-position-horizontal:absolute;mso-position-horizontal-relative:text;mso-position-vertical:absolute;mso-position-vertical-relative:text;mso-width-percent:0;mso-height-percent:0;mso-width-relative:margin;mso-height-relative:margin;v-text-anchor:top" o:gfxdata="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" fillcolor="white [3212]" stroked="f" strokeweight=".5pt">
                 <v:textbox>
                   <w:txbxContent>
                     <w:p>
@@ -1342,7 +1342,7 @@
           </mc:Choice>
           <mc:Fallback>
             <w:pict>
-              <v:roundrect w14:anchorId="7EC59557" id="Rectangle: Rounded Corners 12" o:spid="_x0000_s1029" style="position:absolute;margin-left:28.2pt;margin-top:42.3pt;width:279pt;height:273.6pt;z-index:251667456;visibility:visible;mso-wrap-style:square;mso-width-percent:0;mso-height-percent:0;mso-wrap-distance-left:9pt;mso-wrap-distance-top:0;mso-wrap-distance-right:9pt;mso-wrap-distance-bottom:0;mso-position-horizontal:absolute;mso-position-horizontal-relative:page;mso-position-vertical:absolute;mso-position-vertical-relative:text;mso-width-percent:0;mso-height-percent:0;mso-width-relative:margin;mso-height-relative:margin;v-text-anchor:top" arcsize="1851f" o:gfxdata="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" fillcolor="white [3201]" strokecolor="black [3213]" strokeweight="1pt">
+              <v:roundrect w14:anchorId="7EC59557" id="Rectangle: Rounded Corners 12" o:spid="_x0000_s1034" style="position:absolute;margin-left:28.2pt;margin-top:42.3pt;width:279pt;height:273.6pt;z-index:251667456;visibility:visible;mso-wrap-style:square;mso-width-percent:0;mso-height-percent:0;mso-wrap-distance-left:9pt;mso-wrap-distance-top:0;mso-wrap-distance-right:9pt;mso-wrap-distance-bottom:0;mso-position-horizontal:absolute;mso-position-horizontal-relative:page;mso-position-vertical:absolute;mso-position-vertical-relative:text;mso-width-percent:0;mso-height-percent:0;mso-width-relative:margin;mso-height-relative:margin;v-text-anchor:top" arcsize="1851f" o:gfxdata="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" fillcolor="white [3201]" strokecolor="black [3213]" strokeweight="1pt">
                 <v:stroke joinstyle="miter"/>
                 <v:textbox>
                   <w:txbxContent>
@@ -1514,7 +1514,7 @@
           </mc:Choice>
           <mc:Fallback>
             <w:pict>
-              <v:roundrect w14:anchorId="7D17441D" id="Rectangle: Rounded Corners 3" o:spid="_x0000_s1030" style="position:absolute;margin-left:27pt;margin-top:318.9pt;width:277.8pt;height:53.6pt;z-index:251674624;visibility:visible;mso-wrap-style:square;mso-width-percent:0;mso-height-percent:0;mso-wrap-distance-left:9pt;mso-wrap-distance-top:0;mso-wrap-distance-right:9pt;mso-wrap-distance-bottom:0;mso-position-horizontal:absolute;mso-position-horizontal-relative:page;mso-position-vertical:absolute;mso-position-vertical-relative:text;mso-width-percent:0;mso-height-percent:0;mso-width-relative:margin;mso-height-relative:margin;v-text-anchor:top" arcsize="10923f" o:gfxdata="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" fillcolor="white [3201]" strokecolor="black [3213]" strokeweight="1pt">
+              <v:roundrect w14:anchorId="7D17441D" id="Rectangle: Rounded Corners 3" o:spid="_x0000_s1035" style="position:absolute;margin-left:27pt;margin-top:318.9pt;width:277.8pt;height:53.6pt;z-index:251674624;visibility:visible;mso-wrap-style:square;mso-width-percent:0;mso-height-percent:0;mso-wrap-distance-left:9pt;mso-wrap-distance-top:0;mso-wrap-distance-right:9pt;mso-wrap-distance-bottom:0;mso-position-horizontal:absolute;mso-position-horizontal-relative:page;mso-position-vertical:absolute;mso-position-vertical-relative:text;mso-width-percent:0;mso-height-percent:0;mso-width-relative:margin;mso-height-relative:margin;v-text-anchor:top" arcsize="10923f" o:gfxdata="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" fillcolor="white [3201]" strokecolor="black [3213]" strokeweight="1pt">
                 <v:stroke joinstyle="miter"/>
                 <v:textbox>
                   <w:txbxContent>
@@ -5922,11 +5922,7 @@
                 </mc:Choice>
                 <mc:Fallback>
                   <w:pict>
-                    <v:shapetype w14:anchorId="17F37FC2" id="_x0000_t202" coordsize="21600,21600" o:spt="202" path="m,l,21600r21600,l21600,xe">
-                      <v:stroke joinstyle="miter"/>
-                      <v:path gradientshapeok="t" o:connecttype="rect"/>
-                    </v:shapetype>
-                    <v:shape id="Text Box 31" o:spid="_x0000_s1052" type="#_x0000_t202" style="position:absolute;left:0;text-align:left;margin-left:-2.15pt;margin-top:.85pt;width:107.4pt;height:27.6pt;z-index:251723776;visibility:visible;mso-wrap-style:square;mso-width-percent:0;mso-height-percent:0;mso-wrap-distance-left:9pt;mso-wrap-distance-top:0;mso-wrap-distance-right:9pt;mso-wrap-distance-bottom:0;mso-position-horizontal:absolute;mso-position-horizontal-relative:text;mso-position-vertical:absolute;mso-position-vertical-relative:text;mso-width-percent:0;mso-height-percent:0;mso-width-relative:margin;mso-height-relative:margin;v-text-anchor:top" o:gfxdata="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" filled="f" stroked="f" strokeweight=".5pt">
+                    <v:shape w14:anchorId="17F37FC2" id="Text Box 31" o:spid="_x0000_s1052" type="#_x0000_t202" style="position:absolute;left:0;text-align:left;margin-left:-2.15pt;margin-top:.85pt;width:107.4pt;height:27.6pt;z-index:251723776;visibility:visible;mso-wrap-style:square;mso-width-percent:0;mso-height-percent:0;mso-wrap-distance-left:9pt;mso-wrap-distance-top:0;mso-wrap-distance-right:9pt;mso-wrap-distance-bottom:0;mso-position-horizontal:absolute;mso-position-horizontal-relative:text;mso-position-vertical:absolute;mso-position-vertical-relative:text;mso-width-percent:0;mso-height-percent:0;mso-width-relative:margin;mso-height-relative:margin;v-text-anchor:top" o:gfxdata="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" filled="f" stroked="f" strokeweight=".5pt">
                       <v:textbox>
                         <w:txbxContent>
                           <w:p>
@@ -7046,16 +7042,16 @@
         <mc:AlternateContent>
           <mc:Choice Requires="wps">
             <w:drawing>
-              <wp:anchor distT="0" distB="0" distL="114300" distR="114300" simplePos="0" relativeHeight="251724800" behindDoc="0" locked="0" layoutInCell="1" allowOverlap="1" wp14:anchorId="7843823A" wp14:editId="1678A3EE">
+              <wp:anchor distT="0" distB="0" distL="114300" distR="114300" simplePos="0" relativeHeight="251724800" behindDoc="0" locked="0" layoutInCell="1" allowOverlap="1" wp14:anchorId="7843823A" wp14:editId="7F5E8793">
                 <wp:simplePos x="0" y="0"/>
                 <wp:positionH relativeFrom="column">
-                  <wp:posOffset>2682240</wp:posOffset>
+                  <wp:posOffset>-334608</wp:posOffset>
                 </wp:positionH>
                 <wp:positionV relativeFrom="paragraph">
-                  <wp:posOffset>271145</wp:posOffset>
+                  <wp:posOffset>266700</wp:posOffset>
                 </wp:positionV>
-                <wp:extent cx="1463040" cy="347980"/>
-                <wp:effectExtent l="0" t="0" r="3810" b="0"/>
+                <wp:extent cx="2400701" cy="347980"/>
+                <wp:effectExtent l="0" t="0" r="0" b="0"/>
                 <wp:wrapNone/>
                 <wp:docPr id="1862382824" name="Text Box 32"/>
                 <wp:cNvGraphicFramePr/>
@@ -7066,7 +7062,7 @@
                       <wps:spPr>
                         <a:xfrm>
                           <a:off x="0" y="0"/>
-                          <a:ext cx="1463040" cy="347980"/>
+                          <a:ext cx="2400701" cy="347980"/>
                         </a:xfrm>
                         <a:prstGeom prst="rect">
                           <a:avLst/>
@@ -7126,7 +7122,7 @@
           </mc:Choice>
           <mc:Fallback>
             <w:pict>
-              <v:shape w14:anchorId="7843823A" id="Text Box 32" o:spid="_x0000_s1059" type="#_x0000_t202" style="position:absolute;margin-left:211.2pt;margin-top:21.35pt;width:115.2pt;height:27.4pt;z-index:251724800;visibility:visible;mso-wrap-style:square;mso-width-percent:0;mso-height-percent:0;mso-wrap-distance-left:9pt;mso-wrap-distance-top:0;mso-wrap-distance-right:9pt;mso-wrap-distance-bottom:0;mso-position-horizontal:absolute;mso-position-horizontal-relative:text;mso-position-vertical:absolute;mso-position-vertical-relative:text;mso-width-percent:0;mso-height-percent:0;mso-width-relative:margin;mso-height-relative:margin;v-text-anchor:top" o:gfxdata="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" fillcolor="white [3212]" stroked="f" strokeweight=".5pt">
+              <v:shape w14:anchorId="7843823A" id="Text Box 32" o:spid="_x0000_s1059" type="#_x0000_t202" style="position:absolute;margin-left:-26.35pt;margin-top:21pt;width:189.05pt;height:27.4pt;z-index:251724800;visibility:visible;mso-wrap-style:square;mso-width-percent:0;mso-height-percent:0;mso-wrap-distance-left:9pt;mso-wrap-distance-top:0;mso-wrap-distance-right:9pt;mso-wrap-distance-bottom:0;mso-position-horizontal:absolute;mso-position-horizontal-relative:text;mso-position-vertical:absolute;mso-position-vertical-relative:text;mso-width-percent:0;mso-height-percent:0;mso-width-relative:margin;mso-height-relative:margin;v-text-anchor:top" o:gfxdata="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" fillcolor="white [3212]" stroked="f" strokeweight=".5pt">
                 <v:textbox>
                   <w:txbxContent>
                     <w:p>
@@ -7174,15 +7170,15 @@
         <mc:AlternateContent>
           <mc:Choice Requires="wps">
             <w:drawing>
-              <wp:anchor distT="0" distB="0" distL="114300" distR="114300" simplePos="0" relativeHeight="251726848" behindDoc="0" locked="0" layoutInCell="1" allowOverlap="1" wp14:anchorId="37E379CF" wp14:editId="1C050662">
+              <wp:anchor distT="0" distB="0" distL="114300" distR="114300" simplePos="0" relativeHeight="251726848" behindDoc="0" locked="0" layoutInCell="1" allowOverlap="1" wp14:anchorId="37E379CF" wp14:editId="32682EB7">
                 <wp:simplePos x="0" y="0"/>
                 <wp:positionH relativeFrom="column">
-                  <wp:posOffset>480695</wp:posOffset>
+                  <wp:posOffset>2658034</wp:posOffset>
                 </wp:positionH>
                 <wp:positionV relativeFrom="paragraph">
-                  <wp:posOffset>269240</wp:posOffset>
+                  <wp:posOffset>269277</wp:posOffset>
                 </wp:positionV>
-                <wp:extent cx="1682115" cy="347980"/>
+                <wp:extent cx="1450041" cy="347980"/>
                 <wp:effectExtent l="0" t="0" r="0" b="0"/>
                 <wp:wrapNone/>
                 <wp:docPr id="148650820" name="Text Box 32"/>
@@ -7194,7 +7190,7 @@
                       <wps:spPr>
                         <a:xfrm>
                           <a:off x="0" y="0"/>
-                          <a:ext cx="1682115" cy="347980"/>
+                          <a:ext cx="1450041" cy="347980"/>
                         </a:xfrm>
                         <a:prstGeom prst="rect">
                           <a:avLst/>
@@ -7252,7 +7248,7 @@
           </mc:Choice>
           <mc:Fallback>
             <w:pict>
-              <v:shape w14:anchorId="37E379CF" id="_x0000_s1060" type="#_x0000_t202" style="position:absolute;margin-left:37.85pt;margin-top:21.2pt;width:132.45pt;height:27.4pt;z-index:251726848;visibility:visible;mso-wrap-style:square;mso-width-percent:0;mso-height-percent:0;mso-wrap-distance-left:9pt;mso-wrap-distance-top:0;mso-wrap-distance-right:9pt;mso-wrap-distance-bottom:0;mso-position-horizontal:absolute;mso-position-horizontal-relative:text;mso-position-vertical:absolute;mso-position-vertical-relative:text;mso-width-percent:0;mso-height-percent:0;mso-width-relative:margin;mso-height-relative:margin;v-text-anchor:top" o:gfxdata="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" fillcolor="white [3212]" stroked="f" strokeweight=".5pt">
+              <v:shape w14:anchorId="37E379CF" id="_x0000_s1060" type="#_x0000_t202" style="position:absolute;margin-left:209.3pt;margin-top:21.2pt;width:114.2pt;height:27.4pt;z-index:251726848;visibility:visible;mso-wrap-style:square;mso-width-percent:0;mso-height-percent:0;mso-wrap-distance-left:9pt;mso-wrap-distance-top:0;mso-wrap-distance-right:9pt;mso-wrap-distance-bottom:0;mso-position-horizontal:absolute;mso-position-horizontal-relative:text;mso-position-vertical:absolute;mso-position-vertical-relative:text;mso-width-percent:0;mso-height-percent:0;mso-width-relative:margin;mso-height-relative:margin;v-text-anchor:top" o:gfxdata="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" fillcolor="white [3212]" stroked="f" strokeweight=".5pt">
                 <v:textbox>
                   <w:txbxContent>
                     <w:p>
@@ -7469,7 +7465,7 @@
         <mc:AlternateContent>
           <mc:Choice Requires="wps">
             <w:drawing>
-              <wp:anchor distT="0" distB="0" distL="114300" distR="114300" simplePos="0" relativeHeight="251727872" behindDoc="0" locked="0" layoutInCell="1" allowOverlap="1" wp14:anchorId="3EE9D669" wp14:editId="6C4BCBB5">
+              <wp:anchor distT="0" distB="0" distL="114300" distR="114300" simplePos="0" relativeHeight="251727872" behindDoc="0" locked="0" layoutInCell="1" allowOverlap="1" wp14:anchorId="3EE9D669" wp14:editId="31314D86">
                 <wp:simplePos x="0" y="0"/>
                 <wp:positionH relativeFrom="column">
                   <wp:posOffset>-556260</wp:posOffset>
@@ -7611,7 +7607,37 @@
           <w:rtl/>
           <w:lang w:bidi="fa-IR"/>
         </w:rPr>
-        <w:t>ریال معادل ..................................</w:t>
+        <w:t>تومان معادل</w:t>
+      </w:r>
+      <w:r>
+        <w:rPr>
+          <w:rFonts w:asciiTheme="majorBidi" w:hAnsiTheme="majorBidi" w:cstheme="majorBidi" w:hint="cs"/>
+          <w:b/>
+          <w:bCs/>
+          <w:rtl/>
+          <w:lang w:bidi="fa-IR"/>
+        </w:rPr>
+        <w:t xml:space="preserve"> ....................</w:t>
+      </w:r>
+      <w:r>
+        <w:rPr>
+          <w:rFonts w:asciiTheme="majorBidi" w:hAnsiTheme="majorBidi" w:cstheme="majorBidi" w:hint="cs"/>
+          <w:b/>
+          <w:bCs/>
+          <w:rtl/>
+          <w:lang w:bidi="fa-IR"/>
+        </w:rPr>
+        <w:t>....................</w:t>
+      </w:r>
+      <w:r>
+        <w:rPr>
+          <w:rFonts w:asciiTheme="majorBidi" w:hAnsiTheme="majorBidi" w:cstheme="majorBidi" w:hint="cs"/>
+          <w:b/>
+          <w:bCs/>
+          <w:rtl/>
+          <w:lang w:bidi="fa-IR"/>
+        </w:rPr>
+        <w:t>..............</w:t>
       </w:r>
       <w:r>
         <w:rPr>
@@ -7684,7 +7710,7 @@
         <mc:AlternateContent>
           <mc:Choice Requires="wps">
             <w:drawing>
-              <wp:anchor distT="0" distB="0" distL="114300" distR="114300" simplePos="0" relativeHeight="251663360" behindDoc="0" locked="0" layoutInCell="1" allowOverlap="1" wp14:anchorId="2C8E8BCC" wp14:editId="58CA8038">
+              <wp:anchor distT="0" distB="0" distL="114300" distR="114300" simplePos="0" relativeHeight="251663360" behindDoc="0" locked="0" layoutInCell="1" allowOverlap="1" wp14:anchorId="2C8E8BCC" wp14:editId="0FF4DA6A">
                 <wp:simplePos x="0" y="0"/>
                 <wp:positionH relativeFrom="page">
                   <wp:align>center</wp:align>
@@ -7739,7 +7765,7 @@
           </mc:Choice>
           <mc:Fallback>
             <w:pict>
-              <v:line w14:anchorId="4AEB1627" id="Straight Connector 8" o:spid="_x0000_s1026" style="position:absolute;z-index:251663360;visibility:visible;mso-wrap-style:square;mso-width-percent:0;mso-height-percent:0;mso-wrap-distance-left:9pt;mso-wrap-distance-top:0;mso-wrap-distance-right:9pt;mso-wrap-distance-bottom:0;mso-position-horizontal:center;mso-position-horizontal-relative:page;mso-position-vertical:absolute;mso-position-vertical-relative:text;mso-width-percent:0;mso-height-percent:0;mso-width-relative:margin;mso-height-relative:margin" from="0,18.4pt" to="546pt,18.4pt" o:gfxdata="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" strokecolor="black [3200]" strokeweight=".5pt">
+              <v:line w14:anchorId="312583B0" id="Straight Connector 8" o:spid="_x0000_s1026" style="position:absolute;z-index:251663360;visibility:visible;mso-wrap-style:square;mso-width-percent:0;mso-height-percent:0;mso-wrap-distance-left:9pt;mso-wrap-distance-top:0;mso-wrap-distance-right:9pt;mso-wrap-distance-bottom:0;mso-position-horizontal:center;mso-position-horizontal-relative:page;mso-position-vertical:absolute;mso-position-vertical-relative:text;mso-width-percent:0;mso-height-percent:0;mso-width-relative:margin;mso-height-relative:margin" from="0,18.4pt" to="546pt,18.4pt" o:gfxdata="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" strokecolor="black [3200]" strokeweight=".5pt">
                 <v:stroke joinstyle="miter"/>
                 <w10:wrap anchorx="page"/>
               </v:line>

</xml_diff>

<commit_message>
fix bugs / improve features
</commit_message>
<xml_diff>
--- a/assets/AG.docx
+++ b/assets/AG.docx
@@ -19,6 +19,160 @@
           <w:lang w:bidi="fa-IR"/>
         </w:rPr>
       </w:pPr>
+      <w:r>
+        <w:rPr>
+          <w:rFonts w:asciiTheme="majorBidi" w:hAnsiTheme="majorBidi" w:cstheme="majorBidi"/>
+          <w:noProof/>
+          <w:sz w:val="32"/>
+          <w:szCs w:val="32"/>
+          <w:lang w:bidi="fa-IR"/>
+        </w:rPr>
+        <mc:AlternateContent>
+          <mc:Choice Requires="wps">
+            <w:drawing>
+              <wp:anchor distT="45720" distB="45720" distL="114300" distR="114300" simplePos="0" relativeHeight="251695104" behindDoc="0" locked="0" layoutInCell="1" allowOverlap="1" wp14:anchorId="262D9D07" wp14:editId="0215A4E7">
+                <wp:simplePos x="0" y="0"/>
+                <wp:positionH relativeFrom="column">
+                  <wp:posOffset>3273425</wp:posOffset>
+                </wp:positionH>
+                <wp:positionV relativeFrom="paragraph">
+                  <wp:posOffset>1695450</wp:posOffset>
+                </wp:positionV>
+                <wp:extent cx="2492375" cy="511175"/>
+                <wp:effectExtent l="0" t="0" r="3175" b="3175"/>
+                <wp:wrapSquare wrapText="bothSides"/>
+                <wp:docPr id="1509165845" name="Text Box 2"/>
+                <wp:cNvGraphicFramePr>
+                  <a:graphicFrameLocks xmlns:a="http://schemas.openxmlformats.org/drawingml/2006/main"/>
+                </wp:cNvGraphicFramePr>
+                <a:graphic xmlns:a="http://schemas.openxmlformats.org/drawingml/2006/main">
+                  <a:graphicData uri="http://schemas.microsoft.com/office/word/2010/wordprocessingShape">
+                    <wps:wsp>
+                      <wps:cNvSpPr txBox="1">
+                        <a:spLocks noChangeArrowheads="1"/>
+                      </wps:cNvSpPr>
+                      <wps:spPr bwMode="auto">
+                        <a:xfrm>
+                          <a:off x="0" y="0"/>
+                          <a:ext cx="2492375" cy="511175"/>
+                        </a:xfrm>
+                        <a:prstGeom prst="rect">
+                          <a:avLst/>
+                        </a:prstGeom>
+                        <a:solidFill>
+                          <a:schemeClr val="bg1"/>
+                        </a:solidFill>
+                        <a:ln w="9525">
+                          <a:noFill/>
+                          <a:miter lim="800000"/>
+                          <a:headEnd/>
+                          <a:tailEnd/>
+                        </a:ln>
+                      </wps:spPr>
+                      <wps:txbx>
+                        <w:txbxContent>
+                          <w:p>
+                            <w:pPr>
+                              <w:jc w:val="right"/>
+                              <w:rPr>
+                                <w:rFonts w:ascii="Arial Black" w:hAnsi="Arial Black" w:cs="Aria Black"/>
+                                <w:bCs/>
+                                <w:sz w:val="18"/>
+                                <w:szCs w:val="18"/>
+                                <w:lang w:bidi="fa-IR"/>
+                              </w:rPr>
+                            </w:pPr>
+                            <w:proofErr w:type="spellStart"/>
+                            <w:r>
+                              <w:rPr>
+                                <w:rFonts w:ascii="Arial Black" w:hAnsi="Arial Black" w:cs="Aria Black"/>
+                                <w:bCs/>
+                                <w:sz w:val="18"/>
+                                <w:szCs w:val="18"/>
+                                <w:lang w:bidi="fa-IR"/>
+                              </w:rPr>
+                              <w:t>s</w:t>
+                            </w:r>
+                            <w:r>
+                              <w:rPr>
+                                <w:rFonts w:ascii="Arial Black" w:hAnsi="Arial Black" w:cs="Aria Black"/>
+                                <w:bCs/>
+                                <w:sz w:val="18"/>
+                                <w:szCs w:val="18"/>
+                                <w:lang w:bidi="fa-IR"/>
+                              </w:rPr>
+                              <w:t>eller_adress</w:t>
+                            </w:r>
+                            <w:proofErr w:type="spellEnd"/>
+                          </w:p>
+                        </w:txbxContent>
+                      </wps:txbx>
+                      <wps:bodyPr rot="0" vert="horz" wrap="square" lIns="91440" tIns="45720" rIns="91440" bIns="45720" anchor="t" anchorCtr="0">
+                        <a:noAutofit/>
+                      </wps:bodyPr>
+                    </wps:wsp>
+                  </a:graphicData>
+                </a:graphic>
+                <wp14:sizeRelH relativeFrom="margin">
+                  <wp14:pctWidth>0</wp14:pctWidth>
+                </wp14:sizeRelH>
+                <wp14:sizeRelV relativeFrom="margin">
+                  <wp14:pctHeight>0</wp14:pctHeight>
+                </wp14:sizeRelV>
+              </wp:anchor>
+            </w:drawing>
+          </mc:Choice>
+          <mc:Fallback>
+            <w:pict>
+              <v:shapetype w14:anchorId="262D9D07" id="_x0000_t202" coordsize="21600,21600" o:spt="202" path="m,l,21600r21600,l21600,xe">
+                <v:stroke joinstyle="miter"/>
+                <v:path gradientshapeok="t" o:connecttype="rect"/>
+              </v:shapetype>
+              <v:shape id="Text Box 2" o:spid="_x0000_s1026" type="#_x0000_t202" style="position:absolute;margin-left:257.75pt;margin-top:133.5pt;width:196.25pt;height:40.25pt;z-index:251695104;visibility:visible;mso-wrap-style:square;mso-width-percent:0;mso-height-percent:0;mso-wrap-distance-left:9pt;mso-wrap-distance-top:3.6pt;mso-wrap-distance-right:9pt;mso-wrap-distance-bottom:3.6pt;mso-position-horizontal:absolute;mso-position-horizontal-relative:text;mso-position-vertical:absolute;mso-position-vertical-relative:text;mso-width-percent:0;mso-height-percent:0;mso-width-relative:margin;mso-height-relative:margin;v-text-anchor:top" o:gfxdata="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" fillcolor="white [3212]" stroked="f">
+                <v:textbox>
+                  <w:txbxContent>
+                    <w:p>
+                      <w:pPr>
+                        <w:jc w:val="right"/>
+                        <w:rPr>
+                          <w:rFonts w:ascii="Arial Black" w:hAnsi="Arial Black" w:cs="Aria Black"/>
+                          <w:bCs/>
+                          <w:sz w:val="18"/>
+                          <w:szCs w:val="18"/>
+                          <w:lang w:bidi="fa-IR"/>
+                        </w:rPr>
+                      </w:pPr>
+                      <w:proofErr w:type="spellStart"/>
+                      <w:r>
+                        <w:rPr>
+                          <w:rFonts w:ascii="Arial Black" w:hAnsi="Arial Black" w:cs="Aria Black"/>
+                          <w:bCs/>
+                          <w:sz w:val="18"/>
+                          <w:szCs w:val="18"/>
+                          <w:lang w:bidi="fa-IR"/>
+                        </w:rPr>
+                        <w:t>s</w:t>
+                      </w:r>
+                      <w:r>
+                        <w:rPr>
+                          <w:rFonts w:ascii="Arial Black" w:hAnsi="Arial Black" w:cs="Aria Black"/>
+                          <w:bCs/>
+                          <w:sz w:val="18"/>
+                          <w:szCs w:val="18"/>
+                          <w:lang w:bidi="fa-IR"/>
+                        </w:rPr>
+                        <w:t>eller_adress</w:t>
+                      </w:r>
+                      <w:proofErr w:type="spellEnd"/>
+                    </w:p>
+                  </w:txbxContent>
+                </v:textbox>
+                <w10:wrap type="square"/>
+              </v:shape>
+            </w:pict>
+          </mc:Fallback>
+        </mc:AlternateContent>
+      </w:r>
       <w:r>
         <w:rPr>
           <w:rFonts w:asciiTheme="majorBidi" w:hAnsiTheme="majorBidi" w:cstheme="majorBidi"/>
@@ -168,7 +322,7 @@
         <mc:AlternateContent>
           <mc:Choice Requires="wps">
             <w:drawing>
-              <wp:anchor distT="45720" distB="45720" distL="114300" distR="114300" simplePos="0" relativeHeight="251697152" behindDoc="1" locked="0" layoutInCell="1" allowOverlap="1" wp14:anchorId="4D77C4F4" wp14:editId="30709929">
+              <wp:anchor distT="45720" distB="45720" distL="114300" distR="114300" simplePos="0" relativeHeight="251697152" behindDoc="1" locked="0" layoutInCell="1" allowOverlap="1" wp14:anchorId="4D77C4F4" wp14:editId="6DE7C397">
                 <wp:simplePos x="0" y="0"/>
                 <wp:positionH relativeFrom="column">
                   <wp:posOffset>3279775</wp:posOffset>
@@ -281,7 +435,7 @@
           </mc:Choice>
           <mc:Fallback>
             <w:pict>
-              <v:shape w14:anchorId="4D77C4F4" id="_x0000_s1027" type="#_x0000_t202" style="position:absolute;margin-left:258.25pt;margin-top:194.8pt;width:193pt;height:22.2pt;z-index:-251619328;visibility:visible;mso-wrap-style:square;mso-width-percent:0;mso-height-percent:0;mso-wrap-distance-left:9pt;mso-wrap-distance-top:3.6pt;mso-wrap-distance-right:9pt;mso-wrap-distance-bottom:3.6pt;mso-position-horizontal:absolute;mso-position-horizontal-relative:text;mso-position-vertical:absolute;mso-position-vertical-relative:text;mso-width-percent:0;mso-height-percent:0;mso-width-relative:margin;mso-height-relative:margin;v-text-anchor:top" o:gfxdata="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" fillcolor="white [3212]" stroked="f">
+              <v:shape w14:anchorId="4D77C4F4" id="_x0000_s1028" type="#_x0000_t202" style="position:absolute;margin-left:258.25pt;margin-top:194.8pt;width:193pt;height:22.2pt;z-index:-251619328;visibility:visible;mso-wrap-style:square;mso-width-percent:0;mso-height-percent:0;mso-wrap-distance-left:9pt;mso-wrap-distance-top:3.6pt;mso-wrap-distance-right:9pt;mso-wrap-distance-bottom:3.6pt;mso-position-horizontal:absolute;mso-position-horizontal-relative:text;mso-position-vertical:absolute;mso-position-vertical-relative:text;mso-width-percent:0;mso-height-percent:0;mso-width-relative:margin;mso-height-relative:margin;v-text-anchor:top" o:gfxdata="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" fillcolor="white [3212]" stroked="f">
                 <v:textbox>
                   <w:txbxContent>
                     <w:p>
@@ -332,156 +486,6 @@
                   </w:txbxContent>
                 </v:textbox>
                 <w10:wrap type="tight"/>
-              </v:shape>
-            </w:pict>
-          </mc:Fallback>
-        </mc:AlternateContent>
-      </w:r>
-      <w:r>
-        <w:rPr>
-          <w:rFonts w:asciiTheme="majorBidi" w:hAnsiTheme="majorBidi" w:cstheme="majorBidi"/>
-          <w:noProof/>
-          <w:sz w:val="32"/>
-          <w:szCs w:val="32"/>
-          <w:lang w:bidi="fa-IR"/>
-        </w:rPr>
-        <mc:AlternateContent>
-          <mc:Choice Requires="wps">
-            <w:drawing>
-              <wp:anchor distT="45720" distB="45720" distL="114300" distR="114300" simplePos="0" relativeHeight="251695104" behindDoc="0" locked="0" layoutInCell="1" allowOverlap="1" wp14:anchorId="262D9D07" wp14:editId="00956ADB">
-                <wp:simplePos x="0" y="0"/>
-                <wp:positionH relativeFrom="column">
-                  <wp:posOffset>3273425</wp:posOffset>
-                </wp:positionH>
-                <wp:positionV relativeFrom="paragraph">
-                  <wp:posOffset>1749002</wp:posOffset>
-                </wp:positionV>
-                <wp:extent cx="2492375" cy="511175"/>
-                <wp:effectExtent l="0" t="0" r="3175" b="3175"/>
-                <wp:wrapSquare wrapText="bothSides"/>
-                <wp:docPr id="1509165845" name="Text Box 2"/>
-                <wp:cNvGraphicFramePr>
-                  <a:graphicFrameLocks xmlns:a="http://schemas.openxmlformats.org/drawingml/2006/main"/>
-                </wp:cNvGraphicFramePr>
-                <a:graphic xmlns:a="http://schemas.openxmlformats.org/drawingml/2006/main">
-                  <a:graphicData uri="http://schemas.microsoft.com/office/word/2010/wordprocessingShape">
-                    <wps:wsp>
-                      <wps:cNvSpPr txBox="1">
-                        <a:spLocks noChangeArrowheads="1"/>
-                      </wps:cNvSpPr>
-                      <wps:spPr bwMode="auto">
-                        <a:xfrm>
-                          <a:off x="0" y="0"/>
-                          <a:ext cx="2492375" cy="511175"/>
-                        </a:xfrm>
-                        <a:prstGeom prst="rect">
-                          <a:avLst/>
-                        </a:prstGeom>
-                        <a:solidFill>
-                          <a:schemeClr val="bg1"/>
-                        </a:solidFill>
-                        <a:ln w="9525">
-                          <a:noFill/>
-                          <a:miter lim="800000"/>
-                          <a:headEnd/>
-                          <a:tailEnd/>
-                        </a:ln>
-                      </wps:spPr>
-                      <wps:txbx>
-                        <w:txbxContent>
-                          <w:p>
-                            <w:pPr>
-                              <w:jc w:val="right"/>
-                              <w:rPr>
-                                <w:rFonts w:ascii="Arial Black" w:hAnsi="Arial Black" w:cs="Aria Black"/>
-                                <w:bCs/>
-                                <w:sz w:val="18"/>
-                                <w:szCs w:val="18"/>
-                                <w:lang w:bidi="fa-IR"/>
-                              </w:rPr>
-                            </w:pPr>
-                            <w:proofErr w:type="spellStart"/>
-                            <w:r>
-                              <w:rPr>
-                                <w:rFonts w:ascii="Arial Black" w:hAnsi="Arial Black" w:cs="Aria Black"/>
-                                <w:bCs/>
-                                <w:sz w:val="18"/>
-                                <w:szCs w:val="18"/>
-                                <w:lang w:bidi="fa-IR"/>
-                              </w:rPr>
-                              <w:t>s</w:t>
-                            </w:r>
-                            <w:r>
-                              <w:rPr>
-                                <w:rFonts w:ascii="Arial Black" w:hAnsi="Arial Black" w:cs="Aria Black"/>
-                                <w:bCs/>
-                                <w:sz w:val="18"/>
-                                <w:szCs w:val="18"/>
-                                <w:lang w:bidi="fa-IR"/>
-                              </w:rPr>
-                              <w:t>eller_adress</w:t>
-                            </w:r>
-                            <w:proofErr w:type="spellEnd"/>
-                          </w:p>
-                        </w:txbxContent>
-                      </wps:txbx>
-                      <wps:bodyPr rot="0" vert="horz" wrap="square" lIns="91440" tIns="45720" rIns="91440" bIns="45720" anchor="t" anchorCtr="0">
-                        <a:noAutofit/>
-                      </wps:bodyPr>
-                    </wps:wsp>
-                  </a:graphicData>
-                </a:graphic>
-                <wp14:sizeRelH relativeFrom="margin">
-                  <wp14:pctWidth>0</wp14:pctWidth>
-                </wp14:sizeRelH>
-                <wp14:sizeRelV relativeFrom="margin">
-                  <wp14:pctHeight>0</wp14:pctHeight>
-                </wp14:sizeRelV>
-              </wp:anchor>
-            </w:drawing>
-          </mc:Choice>
-          <mc:Fallback>
-            <w:pict>
-              <v:shape w14:anchorId="262D9D07" id="_x0000_s1028" type="#_x0000_t202" style="position:absolute;margin-left:257.75pt;margin-top:137.7pt;width:196.25pt;height:40.25pt;z-index:251695104;visibility:visible;mso-wrap-style:square;mso-width-percent:0;mso-height-percent:0;mso-wrap-distance-left:9pt;mso-wrap-distance-top:3.6pt;mso-wrap-distance-right:9pt;mso-wrap-distance-bottom:3.6pt;mso-position-horizontal:absolute;mso-position-horizontal-relative:text;mso-position-vertical:absolute;mso-position-vertical-relative:text;mso-width-percent:0;mso-height-percent:0;mso-width-relative:margin;mso-height-relative:margin;v-text-anchor:top" o:gfxdata="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" fillcolor="white [3212]" stroked="f">
-                <v:textbox>
-                  <w:txbxContent>
-                    <w:p>
-                      <w:pPr>
-                        <w:jc w:val="right"/>
-                        <w:rPr>
-                          <w:rFonts w:ascii="Arial Black" w:hAnsi="Arial Black" w:cs="Aria Black"/>
-                          <w:bCs/>
-                          <w:sz w:val="18"/>
-                          <w:szCs w:val="18"/>
-                          <w:lang w:bidi="fa-IR"/>
-                        </w:rPr>
-                      </w:pPr>
-                      <w:proofErr w:type="spellStart"/>
-                      <w:r>
-                        <w:rPr>
-                          <w:rFonts w:ascii="Arial Black" w:hAnsi="Arial Black" w:cs="Aria Black"/>
-                          <w:bCs/>
-                          <w:sz w:val="18"/>
-                          <w:szCs w:val="18"/>
-                          <w:lang w:bidi="fa-IR"/>
-                        </w:rPr>
-                        <w:t>s</w:t>
-                      </w:r>
-                      <w:r>
-                        <w:rPr>
-                          <w:rFonts w:ascii="Arial Black" w:hAnsi="Arial Black" w:cs="Aria Black"/>
-                          <w:bCs/>
-                          <w:sz w:val="18"/>
-                          <w:szCs w:val="18"/>
-                          <w:lang w:bidi="fa-IR"/>
-                        </w:rPr>
-                        <w:t>eller_adress</w:t>
-                      </w:r>
-                      <w:proofErr w:type="spellEnd"/>
-                    </w:p>
-                  </w:txbxContent>
-                </v:textbox>
-                <w10:wrap type="square"/>
               </v:shape>
             </w:pict>
           </mc:Fallback>
@@ -1173,8 +1177,8 @@
                                 <w:rFonts w:ascii="Active" w:hAnsi="Active" w:cs="Aria Black"/>
                                 <w:b/>
                                 <w:bCs/>
-                                <w:sz w:val="14"/>
-                                <w:szCs w:val="14"/>
+                                <w:sz w:val="16"/>
+                                <w:szCs w:val="16"/>
                               </w:rPr>
                             </w:pPr>
                             <w:proofErr w:type="spellStart"/>
@@ -1183,8 +1187,8 @@
                                 <w:rFonts w:ascii="Active" w:hAnsi="Active" w:cs="Aria Black"/>
                                 <w:b/>
                                 <w:bCs/>
-                                <w:sz w:val="14"/>
-                                <w:szCs w:val="14"/>
+                                <w:sz w:val="16"/>
+                                <w:szCs w:val="16"/>
                               </w:rPr>
                               <w:t>car_info</w:t>
                             </w:r>
@@ -1222,8 +1226,8 @@
                           <w:rFonts w:ascii="Active" w:hAnsi="Active" w:cs="Aria Black"/>
                           <w:b/>
                           <w:bCs/>
-                          <w:sz w:val="14"/>
-                          <w:szCs w:val="14"/>
+                          <w:sz w:val="16"/>
+                          <w:szCs w:val="16"/>
                         </w:rPr>
                       </w:pPr>
                       <w:proofErr w:type="spellStart"/>
@@ -1232,8 +1236,8 @@
                           <w:rFonts w:ascii="Active" w:hAnsi="Active" w:cs="Aria Black"/>
                           <w:b/>
                           <w:bCs/>
-                          <w:sz w:val="14"/>
-                          <w:szCs w:val="14"/>
+                          <w:sz w:val="16"/>
+                          <w:szCs w:val="16"/>
                         </w:rPr>
                         <w:t>car_info</w:t>
                       </w:r>
@@ -6172,6 +6176,7 @@
                               <w:txbxContent>
                                 <w:p>
                                   <w:pPr>
+                                    <w:jc w:val="center"/>
                                     <w:rPr>
                                       <w:rFonts w:ascii="Arial Black" w:hAnsi="Arial Black" w:cs="Aria Black"/>
                                       <w:b/>
@@ -6220,6 +6225,7 @@
                         <w:txbxContent>
                           <w:p>
                             <w:pPr>
+                              <w:jc w:val="center"/>
                               <w:rPr>
                                 <w:rFonts w:ascii="Arial Black" w:hAnsi="Arial Black" w:cs="Aria Black"/>
                                 <w:b/>
@@ -6467,8 +6473,8 @@
                                       <w:rFonts w:ascii="Arial Black" w:hAnsi="Arial Black" w:cs="Aria Black"/>
                                       <w:b/>
                                       <w:bCs/>
-                                      <w:sz w:val="14"/>
-                                      <w:szCs w:val="14"/>
+                                      <w:sz w:val="12"/>
+                                      <w:szCs w:val="12"/>
                                     </w:rPr>
                                   </w:pPr>
                                   <w:proofErr w:type="spellStart"/>
@@ -6477,8 +6483,8 @@
                                       <w:rFonts w:ascii="Arial Black" w:hAnsi="Arial Black" w:cs="Aria Black"/>
                                       <w:b/>
                                       <w:bCs/>
-                                      <w:sz w:val="14"/>
-                                      <w:szCs w:val="14"/>
+                                      <w:sz w:val="12"/>
+                                      <w:szCs w:val="12"/>
                                     </w:rPr>
                                     <w:t>car_system</w:t>
                                   </w:r>
@@ -6516,8 +6522,8 @@
                                 <w:rFonts w:ascii="Arial Black" w:hAnsi="Arial Black" w:cs="Aria Black"/>
                                 <w:b/>
                                 <w:bCs/>
-                                <w:sz w:val="14"/>
-                                <w:szCs w:val="14"/>
+                                <w:sz w:val="12"/>
+                                <w:szCs w:val="12"/>
                               </w:rPr>
                             </w:pPr>
                             <w:proofErr w:type="spellStart"/>
@@ -6526,8 +6532,8 @@
                                 <w:rFonts w:ascii="Arial Black" w:hAnsi="Arial Black" w:cs="Aria Black"/>
                                 <w:b/>
                                 <w:bCs/>
-                                <w:sz w:val="14"/>
-                                <w:szCs w:val="14"/>
+                                <w:sz w:val="12"/>
+                                <w:szCs w:val="12"/>
                               </w:rPr>
                               <w:t>car_system</w:t>
                             </w:r>
@@ -6614,8 +6620,8 @@
                                       <w:rFonts w:ascii="Arial Black" w:hAnsi="Arial Black" w:cs="Aria Black"/>
                                       <w:b/>
                                       <w:bCs/>
-                                      <w:sz w:val="16"/>
-                                      <w:szCs w:val="16"/>
+                                      <w:sz w:val="14"/>
+                                      <w:szCs w:val="14"/>
                                     </w:rPr>
                                   </w:pPr>
                                   <w:proofErr w:type="spellStart"/>
@@ -6624,8 +6630,8 @@
                                       <w:rFonts w:ascii="Arial Black" w:hAnsi="Arial Black" w:cs="Aria Black"/>
                                       <w:b/>
                                       <w:bCs/>
-                                      <w:sz w:val="16"/>
-                                      <w:szCs w:val="16"/>
+                                      <w:sz w:val="14"/>
+                                      <w:szCs w:val="14"/>
                                     </w:rPr>
                                     <w:t>car_color</w:t>
                                   </w:r>
@@ -6663,8 +6669,8 @@
                                 <w:rFonts w:ascii="Arial Black" w:hAnsi="Arial Black" w:cs="Aria Black"/>
                                 <w:b/>
                                 <w:bCs/>
-                                <w:sz w:val="16"/>
-                                <w:szCs w:val="16"/>
+                                <w:sz w:val="14"/>
+                                <w:szCs w:val="14"/>
                               </w:rPr>
                             </w:pPr>
                             <w:proofErr w:type="spellStart"/>
@@ -6673,8 +6679,8 @@
                                 <w:rFonts w:ascii="Arial Black" w:hAnsi="Arial Black" w:cs="Aria Black"/>
                                 <w:b/>
                                 <w:bCs/>
-                                <w:sz w:val="16"/>
-                                <w:szCs w:val="16"/>
+                                <w:sz w:val="14"/>
+                                <w:szCs w:val="14"/>
                               </w:rPr>
                               <w:t>car_color</w:t>
                             </w:r>
@@ -6761,8 +6767,8 @@
                                       <w:rFonts w:ascii="Arial Black" w:hAnsi="Arial Black" w:cs="Aria Black"/>
                                       <w:b/>
                                       <w:bCs/>
-                                      <w:sz w:val="16"/>
-                                      <w:szCs w:val="16"/>
+                                      <w:sz w:val="14"/>
+                                      <w:szCs w:val="14"/>
                                     </w:rPr>
                                   </w:pPr>
                                   <w:proofErr w:type="spellStart"/>
@@ -6771,8 +6777,8 @@
                                       <w:rFonts w:ascii="Arial Black" w:hAnsi="Arial Black" w:cs="Aria Black"/>
                                       <w:b/>
                                       <w:bCs/>
-                                      <w:sz w:val="16"/>
-                                      <w:szCs w:val="16"/>
+                                      <w:sz w:val="14"/>
+                                      <w:szCs w:val="14"/>
                                     </w:rPr>
                                     <w:t>car_type</w:t>
                                   </w:r>
@@ -6810,8 +6816,8 @@
                                 <w:rFonts w:ascii="Arial Black" w:hAnsi="Arial Black" w:cs="Aria Black"/>
                                 <w:b/>
                                 <w:bCs/>
-                                <w:sz w:val="16"/>
-                                <w:szCs w:val="16"/>
+                                <w:sz w:val="14"/>
+                                <w:szCs w:val="14"/>
                               </w:rPr>
                             </w:pPr>
                             <w:proofErr w:type="spellStart"/>
@@ -6820,8 +6826,8 @@
                                 <w:rFonts w:ascii="Arial Black" w:hAnsi="Arial Black" w:cs="Aria Black"/>
                                 <w:b/>
                                 <w:bCs/>
-                                <w:sz w:val="16"/>
-                                <w:szCs w:val="16"/>
+                                <w:sz w:val="14"/>
+                                <w:szCs w:val="14"/>
                               </w:rPr>
                               <w:t>car_type</w:t>
                             </w:r>
@@ -7083,8 +7089,8 @@
                                 <w:rFonts w:ascii="Arial Black" w:hAnsi="Arial Black" w:cs="Aria Black"/>
                                 <w:b/>
                                 <w:bCs/>
-                                <w:sz w:val="16"/>
-                                <w:szCs w:val="20"/>
+                                <w:sz w:val="14"/>
+                                <w:szCs w:val="18"/>
                               </w:rPr>
                             </w:pPr>
                             <w:proofErr w:type="spellStart"/>
@@ -7093,8 +7099,8 @@
                                 <w:rFonts w:ascii="Arial Black" w:hAnsi="Arial Black" w:cs="Aria Black"/>
                                 <w:b/>
                                 <w:bCs/>
-                                <w:sz w:val="16"/>
-                                <w:szCs w:val="20"/>
+                                <w:sz w:val="14"/>
+                                <w:szCs w:val="18"/>
                               </w:rPr>
                               <w:t>price_rial</w:t>
                             </w:r>
@@ -7132,8 +7138,8 @@
                           <w:rFonts w:ascii="Arial Black" w:hAnsi="Arial Black" w:cs="Aria Black"/>
                           <w:b/>
                           <w:bCs/>
-                          <w:sz w:val="16"/>
-                          <w:szCs w:val="20"/>
+                          <w:sz w:val="14"/>
+                          <w:szCs w:val="18"/>
                         </w:rPr>
                       </w:pPr>
                       <w:proofErr w:type="spellStart"/>
@@ -7142,8 +7148,8 @@
                           <w:rFonts w:ascii="Arial Black" w:hAnsi="Arial Black" w:cs="Aria Black"/>
                           <w:b/>
                           <w:bCs/>
-                          <w:sz w:val="16"/>
-                          <w:szCs w:val="20"/>
+                          <w:sz w:val="14"/>
+                          <w:szCs w:val="18"/>
                         </w:rPr>
                         <w:t>price_rial</w:t>
                       </w:r>
@@ -7210,8 +7216,8 @@
                               <w:rPr>
                                 <w:rFonts w:ascii="Arial Black" w:hAnsi="Arial Black" w:cs="Aria Black"/>
                                 <w:bCs/>
-                                <w:sz w:val="16"/>
-                                <w:szCs w:val="16"/>
+                                <w:sz w:val="14"/>
+                                <w:szCs w:val="14"/>
                               </w:rPr>
                             </w:pPr>
                             <w:proofErr w:type="spellStart"/>
@@ -7219,8 +7225,8 @@
                               <w:rPr>
                                 <w:rFonts w:ascii="Arial Black" w:hAnsi="Arial Black" w:cs="Aria Black"/>
                                 <w:bCs/>
-                                <w:sz w:val="16"/>
-                                <w:szCs w:val="16"/>
+                                <w:sz w:val="14"/>
+                                <w:szCs w:val="14"/>
                               </w:rPr>
                               <w:t>price_toman</w:t>
                             </w:r>
@@ -7257,8 +7263,8 @@
                         <w:rPr>
                           <w:rFonts w:ascii="Arial Black" w:hAnsi="Arial Black" w:cs="Aria Black"/>
                           <w:bCs/>
-                          <w:sz w:val="16"/>
-                          <w:szCs w:val="16"/>
+                          <w:sz w:val="14"/>
+                          <w:szCs w:val="14"/>
                         </w:rPr>
                       </w:pPr>
                       <w:proofErr w:type="spellStart"/>
@@ -7266,8 +7272,8 @@
                         <w:rPr>
                           <w:rFonts w:ascii="Arial Black" w:hAnsi="Arial Black" w:cs="Aria Black"/>
                           <w:bCs/>
-                          <w:sz w:val="16"/>
-                          <w:szCs w:val="16"/>
+                          <w:sz w:val="14"/>
+                          <w:szCs w:val="14"/>
                         </w:rPr>
                         <w:t>price_toman</w:t>
                       </w:r>
@@ -7506,8 +7512,8 @@
                                 <w:rFonts w:ascii="Arial Black" w:hAnsi="Arial Black" w:cs="Aria Black"/>
                                 <w:b/>
                                 <w:bCs/>
-                                <w:sz w:val="18"/>
-                                <w:szCs w:val="20"/>
+                                <w:sz w:val="16"/>
+                                <w:szCs w:val="18"/>
                               </w:rPr>
                             </w:pPr>
                             <w:proofErr w:type="spellStart"/>
@@ -7516,8 +7522,8 @@
                                 <w:rFonts w:ascii="Arial Black" w:hAnsi="Arial Black" w:cs="Aria Black"/>
                                 <w:b/>
                                 <w:bCs/>
-                                <w:sz w:val="18"/>
-                                <w:szCs w:val="20"/>
+                                <w:sz w:val="16"/>
+                                <w:szCs w:val="18"/>
                               </w:rPr>
                               <w:t>price_info</w:t>
                             </w:r>
@@ -7555,8 +7561,8 @@
                           <w:rFonts w:ascii="Arial Black" w:hAnsi="Arial Black" w:cs="Aria Black"/>
                           <w:b/>
                           <w:bCs/>
-                          <w:sz w:val="18"/>
-                          <w:szCs w:val="20"/>
+                          <w:sz w:val="16"/>
+                          <w:szCs w:val="18"/>
                         </w:rPr>
                       </w:pPr>
                       <w:proofErr w:type="spellStart"/>
@@ -7565,8 +7571,8 @@
                           <w:rFonts w:ascii="Arial Black" w:hAnsi="Arial Black" w:cs="Aria Black"/>
                           <w:b/>
                           <w:bCs/>
-                          <w:sz w:val="18"/>
-                          <w:szCs w:val="20"/>
+                          <w:sz w:val="16"/>
+                          <w:szCs w:val="18"/>
                         </w:rPr>
                         <w:t>price_info</w:t>
                       </w:r>
@@ -7977,8 +7983,8 @@
                                 <w:rFonts w:ascii="Arial Black" w:hAnsi="Arial Black" w:cs="Aria Black"/>
                                 <w:b/>
                                 <w:bCs/>
-                                <w:sz w:val="12"/>
-                                <w:szCs w:val="10"/>
+                                <w:sz w:val="14"/>
+                                <w:szCs w:val="12"/>
                                 <w:rtl/>
                                 <w:lang w:bidi="fa-IR"/>
                               </w:rPr>
@@ -7989,8 +7995,8 @@
                                 <w:rFonts w:ascii="Arial Black" w:hAnsi="Arial Black" w:cs="Aria Black"/>
                                 <w:b/>
                                 <w:bCs/>
-                                <w:sz w:val="12"/>
-                                <w:szCs w:val="10"/>
+                                <w:sz w:val="14"/>
+                                <w:szCs w:val="12"/>
                                 <w:lang w:bidi="fa-IR"/>
                               </w:rPr>
                               <w:t>deal_date</w:t>
@@ -8029,8 +8035,8 @@
                           <w:rFonts w:ascii="Arial Black" w:hAnsi="Arial Black" w:cs="Aria Black"/>
                           <w:b/>
                           <w:bCs/>
-                          <w:sz w:val="12"/>
-                          <w:szCs w:val="10"/>
+                          <w:sz w:val="14"/>
+                          <w:szCs w:val="12"/>
                           <w:rtl/>
                           <w:lang w:bidi="fa-IR"/>
                         </w:rPr>
@@ -8041,8 +8047,8 @@
                           <w:rFonts w:ascii="Arial Black" w:hAnsi="Arial Black" w:cs="Aria Black"/>
                           <w:b/>
                           <w:bCs/>
-                          <w:sz w:val="12"/>
-                          <w:szCs w:val="10"/>
+                          <w:sz w:val="14"/>
+                          <w:szCs w:val="12"/>
                           <w:lang w:bidi="fa-IR"/>
                         </w:rPr>
                         <w:t>deal_date</w:t>
@@ -8259,8 +8265,8 @@
                                 <w:rFonts w:ascii="Arial Black" w:hAnsi="Arial Black" w:cs="Aria Black"/>
                                 <w:b/>
                                 <w:bCs/>
-                                <w:sz w:val="12"/>
-                                <w:szCs w:val="12"/>
+                                <w:sz w:val="14"/>
+                                <w:szCs w:val="14"/>
                                 <w:rtl/>
                                 <w:lang w:bidi="fa-IR"/>
                               </w:rPr>
@@ -8271,8 +8277,8 @@
                                 <w:rFonts w:ascii="Arial Black" w:hAnsi="Arial Black" w:cs="Aria Black"/>
                                 <w:b/>
                                 <w:bCs/>
-                                <w:sz w:val="12"/>
-                                <w:szCs w:val="12"/>
+                                <w:sz w:val="14"/>
+                                <w:szCs w:val="14"/>
                                 <w:lang w:bidi="fa-IR"/>
                               </w:rPr>
                               <w:t>deal_time</w:t>
@@ -8311,8 +8317,8 @@
                           <w:rFonts w:ascii="Arial Black" w:hAnsi="Arial Black" w:cs="Aria Black"/>
                           <w:b/>
                           <w:bCs/>
-                          <w:sz w:val="12"/>
-                          <w:szCs w:val="12"/>
+                          <w:sz w:val="14"/>
+                          <w:szCs w:val="14"/>
                           <w:rtl/>
                           <w:lang w:bidi="fa-IR"/>
                         </w:rPr>
@@ -8323,8 +8329,8 @@
                           <w:rFonts w:ascii="Arial Black" w:hAnsi="Arial Black" w:cs="Aria Black"/>
                           <w:b/>
                           <w:bCs/>
-                          <w:sz w:val="12"/>
-                          <w:szCs w:val="12"/>
+                          <w:sz w:val="14"/>
+                          <w:szCs w:val="14"/>
                           <w:lang w:bidi="fa-IR"/>
                         </w:rPr>
                         <w:t>deal_time</w:t>
@@ -8393,8 +8399,8 @@
                               <w:rPr>
                                 <w:rFonts w:ascii="Arial Black" w:hAnsi="Arial Black" w:cs="Aria Black"/>
                                 <w:bCs/>
-                                <w:sz w:val="12"/>
-                                <w:szCs w:val="12"/>
+                                <w:sz w:val="14"/>
+                                <w:szCs w:val="14"/>
                                 <w:lang w:bidi="fa-IR"/>
                               </w:rPr>
                             </w:pPr>
@@ -8403,8 +8409,8 @@
                               <w:rPr>
                                 <w:rFonts w:ascii="Arial Black" w:hAnsi="Arial Black" w:cs="Aria Black"/>
                                 <w:bCs/>
-                                <w:sz w:val="12"/>
-                                <w:szCs w:val="12"/>
+                                <w:sz w:val="14"/>
+                                <w:szCs w:val="14"/>
                                 <w:lang w:bidi="fa-IR"/>
                               </w:rPr>
                               <w:t>car_kilometer</w:t>
@@ -8443,8 +8449,8 @@
                         <w:rPr>
                           <w:rFonts w:ascii="Arial Black" w:hAnsi="Arial Black" w:cs="Aria Black"/>
                           <w:bCs/>
-                          <w:sz w:val="12"/>
-                          <w:szCs w:val="12"/>
+                          <w:sz w:val="14"/>
+                          <w:szCs w:val="14"/>
                           <w:lang w:bidi="fa-IR"/>
                         </w:rPr>
                       </w:pPr>
@@ -8453,8 +8459,8 @@
                         <w:rPr>
                           <w:rFonts w:ascii="Arial Black" w:hAnsi="Arial Black" w:cs="Aria Black"/>
                           <w:bCs/>
-                          <w:sz w:val="12"/>
-                          <w:szCs w:val="12"/>
+                          <w:sz w:val="14"/>
+                          <w:szCs w:val="14"/>
                           <w:lang w:bidi="fa-IR"/>
                         </w:rPr>
                         <w:t>car_kilometer</w:t>
@@ -8523,8 +8529,8 @@
                                 <w:rFonts w:ascii="Arial Black" w:hAnsi="Arial Black" w:cs="Aria Black"/>
                                 <w:b/>
                                 <w:bCs/>
-                                <w:sz w:val="10"/>
-                                <w:szCs w:val="10"/>
+                                <w:sz w:val="14"/>
+                                <w:szCs w:val="14"/>
                                 <w:rtl/>
                                 <w:lang w:bidi="fa-IR"/>
                               </w:rPr>
@@ -8535,8 +8541,8 @@
                                 <w:rFonts w:ascii="Arial Black" w:hAnsi="Arial Black" w:cs="Aria Black"/>
                                 <w:b/>
                                 <w:bCs/>
-                                <w:sz w:val="10"/>
-                                <w:szCs w:val="10"/>
+                                <w:sz w:val="14"/>
+                                <w:szCs w:val="14"/>
                                 <w:lang w:bidi="fa-IR"/>
                               </w:rPr>
                               <w:t>deal_date</w:t>
@@ -8575,8 +8581,8 @@
                           <w:rFonts w:ascii="Arial Black" w:hAnsi="Arial Black" w:cs="Aria Black"/>
                           <w:b/>
                           <w:bCs/>
-                          <w:sz w:val="10"/>
-                          <w:szCs w:val="10"/>
+                          <w:sz w:val="14"/>
+                          <w:szCs w:val="14"/>
                           <w:rtl/>
                           <w:lang w:bidi="fa-IR"/>
                         </w:rPr>
@@ -8587,8 +8593,8 @@
                           <w:rFonts w:ascii="Arial Black" w:hAnsi="Arial Black" w:cs="Aria Black"/>
                           <w:b/>
                           <w:bCs/>
-                          <w:sz w:val="10"/>
-                          <w:szCs w:val="10"/>
+                          <w:sz w:val="14"/>
+                          <w:szCs w:val="14"/>
                           <w:lang w:bidi="fa-IR"/>
                         </w:rPr>
                         <w:t>deal_date</w:t>
@@ -9244,7 +9250,8 @@
                                 <w:rFonts w:ascii="Arial Black" w:hAnsi="Arial Black" w:cs="Aria Black"/>
                                 <w:b/>
                                 <w:bCs/>
-                                <w:sz w:val="18"/>
+                                <w:sz w:val="16"/>
+                                <w:szCs w:val="20"/>
                               </w:rPr>
                             </w:pPr>
                             <w:proofErr w:type="spellStart"/>
@@ -9253,7 +9260,8 @@
                                 <w:rFonts w:ascii="Arial Black" w:hAnsi="Arial Black" w:cs="Aria Black"/>
                                 <w:b/>
                                 <w:bCs/>
-                                <w:sz w:val="18"/>
+                                <w:sz w:val="16"/>
+                                <w:szCs w:val="20"/>
                               </w:rPr>
                               <w:t>s</w:t>
                             </w:r>
@@ -9262,7 +9270,8 @@
                                 <w:rFonts w:ascii="Arial Black" w:hAnsi="Arial Black" w:cs="Aria Black"/>
                                 <w:b/>
                                 <w:bCs/>
-                                <w:sz w:val="18"/>
+                                <w:sz w:val="16"/>
+                                <w:szCs w:val="20"/>
                               </w:rPr>
                               <w:t>eller_</w:t>
                             </w:r>
@@ -9271,7 +9280,8 @@
                                 <w:rFonts w:ascii="Arial Black" w:hAnsi="Arial Black" w:cs="Aria Black"/>
                                 <w:b/>
                                 <w:bCs/>
-                                <w:sz w:val="18"/>
+                                <w:sz w:val="16"/>
+                                <w:szCs w:val="20"/>
                               </w:rPr>
                               <w:t>f</w:t>
                             </w:r>
@@ -9280,7 +9290,8 @@
                                 <w:rFonts w:ascii="Arial Black" w:hAnsi="Arial Black" w:cs="Aria Black"/>
                                 <w:b/>
                                 <w:bCs/>
-                                <w:sz w:val="18"/>
+                                <w:sz w:val="16"/>
+                                <w:szCs w:val="20"/>
                               </w:rPr>
                               <w:t>n</w:t>
                             </w:r>
@@ -9289,7 +9300,8 @@
                                 <w:rFonts w:ascii="Arial Black" w:hAnsi="Arial Black" w:cs="Aria Black"/>
                                 <w:b/>
                                 <w:bCs/>
-                                <w:sz w:val="18"/>
+                                <w:sz w:val="16"/>
+                                <w:szCs w:val="20"/>
                               </w:rPr>
                               <w:t>ame</w:t>
                             </w:r>
@@ -9327,7 +9339,8 @@
                           <w:rFonts w:ascii="Arial Black" w:hAnsi="Arial Black" w:cs="Aria Black"/>
                           <w:b/>
                           <w:bCs/>
-                          <w:sz w:val="18"/>
+                          <w:sz w:val="16"/>
+                          <w:szCs w:val="20"/>
                         </w:rPr>
                       </w:pPr>
                       <w:proofErr w:type="spellStart"/>
@@ -9336,7 +9349,8 @@
                           <w:rFonts w:ascii="Arial Black" w:hAnsi="Arial Black" w:cs="Aria Black"/>
                           <w:b/>
                           <w:bCs/>
-                          <w:sz w:val="18"/>
+                          <w:sz w:val="16"/>
+                          <w:szCs w:val="20"/>
                         </w:rPr>
                         <w:t>s</w:t>
                       </w:r>
@@ -9345,7 +9359,8 @@
                           <w:rFonts w:ascii="Arial Black" w:hAnsi="Arial Black" w:cs="Aria Black"/>
                           <w:b/>
                           <w:bCs/>
-                          <w:sz w:val="18"/>
+                          <w:sz w:val="16"/>
+                          <w:szCs w:val="20"/>
                         </w:rPr>
                         <w:t>eller_</w:t>
                       </w:r>
@@ -9354,7 +9369,8 @@
                           <w:rFonts w:ascii="Arial Black" w:hAnsi="Arial Black" w:cs="Aria Black"/>
                           <w:b/>
                           <w:bCs/>
-                          <w:sz w:val="18"/>
+                          <w:sz w:val="16"/>
+                          <w:szCs w:val="20"/>
                         </w:rPr>
                         <w:t>f</w:t>
                       </w:r>
@@ -9363,7 +9379,8 @@
                           <w:rFonts w:ascii="Arial Black" w:hAnsi="Arial Black" w:cs="Aria Black"/>
                           <w:b/>
                           <w:bCs/>
-                          <w:sz w:val="18"/>
+                          <w:sz w:val="16"/>
+                          <w:szCs w:val="20"/>
                         </w:rPr>
                         <w:t>n</w:t>
                       </w:r>
@@ -9372,7 +9389,8 @@
                           <w:rFonts w:ascii="Arial Black" w:hAnsi="Arial Black" w:cs="Aria Black"/>
                           <w:b/>
                           <w:bCs/>
-                          <w:sz w:val="18"/>
+                          <w:sz w:val="16"/>
+                          <w:szCs w:val="20"/>
                         </w:rPr>
                         <w:t>ame</w:t>
                       </w:r>

</xml_diff>

<commit_message>
AG.docx updated - AG-Change.docx added - str.py deleted
</commit_message>
<xml_diff>
--- a/assets/AG.docx
+++ b/assets/AG.docx
@@ -5887,8 +5887,8 @@
                                       <w:rFonts w:ascii="Arial Black" w:hAnsi="Arial Black" w:cs="Aria Black"/>
                                       <w:b/>
                                       <w:bCs/>
-                                      <w:sz w:val="14"/>
-                                      <w:szCs w:val="14"/>
+                                      <w:sz w:val="12"/>
+                                      <w:szCs w:val="12"/>
                                     </w:rPr>
                                   </w:pPr>
                                   <w:proofErr w:type="spellStart"/>
@@ -5897,8 +5897,8 @@
                                       <w:rFonts w:ascii="Arial Black" w:hAnsi="Arial Black" w:cs="Aria Black"/>
                                       <w:b/>
                                       <w:bCs/>
-                                      <w:sz w:val="14"/>
-                                      <w:szCs w:val="14"/>
+                                      <w:sz w:val="12"/>
+                                      <w:szCs w:val="12"/>
                                     </w:rPr>
                                     <w:t>body_id</w:t>
                                   </w:r>
@@ -5926,7 +5926,11 @@
                 </mc:Choice>
                 <mc:Fallback>
                   <w:pict>
-                    <v:shape w14:anchorId="17F37FC2" id="Text Box 31" o:spid="_x0000_s1052" type="#_x0000_t202" style="position:absolute;left:0;text-align:left;margin-left:-2.15pt;margin-top:.85pt;width:107.4pt;height:27.6pt;z-index:251723776;visibility:visible;mso-wrap-style:square;mso-width-percent:0;mso-height-percent:0;mso-wrap-distance-left:9pt;mso-wrap-distance-top:0;mso-wrap-distance-right:9pt;mso-wrap-distance-bottom:0;mso-position-horizontal:absolute;mso-position-horizontal-relative:text;mso-position-vertical:absolute;mso-position-vertical-relative:text;mso-width-percent:0;mso-height-percent:0;mso-width-relative:margin;mso-height-relative:margin;v-text-anchor:top" o:gfxdata="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" filled="f" stroked="f" strokeweight=".5pt">
+                    <v:shapetype w14:anchorId="17F37FC2" id="_x0000_t202" coordsize="21600,21600" o:spt="202" path="m,l,21600r21600,l21600,xe">
+                      <v:stroke joinstyle="miter"/>
+                      <v:path gradientshapeok="t" o:connecttype="rect"/>
+                    </v:shapetype>
+                    <v:shape id="Text Box 31" o:spid="_x0000_s1052" type="#_x0000_t202" style="position:absolute;left:0;text-align:left;margin-left:-2.15pt;margin-top:.85pt;width:107.4pt;height:27.6pt;z-index:251723776;visibility:visible;mso-wrap-style:square;mso-width-percent:0;mso-height-percent:0;mso-wrap-distance-left:9pt;mso-wrap-distance-top:0;mso-wrap-distance-right:9pt;mso-wrap-distance-bottom:0;mso-position-horizontal:absolute;mso-position-horizontal-relative:text;mso-position-vertical:absolute;mso-position-vertical-relative:text;mso-width-percent:0;mso-height-percent:0;mso-width-relative:margin;mso-height-relative:margin;v-text-anchor:top" o:gfxdata="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" filled="f" stroked="f" strokeweight=".5pt">
                       <v:textbox>
                         <w:txbxContent>
                           <w:p>
@@ -5936,8 +5940,8 @@
                                 <w:rFonts w:ascii="Arial Black" w:hAnsi="Arial Black" w:cs="Aria Black"/>
                                 <w:b/>
                                 <w:bCs/>
-                                <w:sz w:val="14"/>
-                                <w:szCs w:val="14"/>
+                                <w:sz w:val="12"/>
+                                <w:szCs w:val="12"/>
                               </w:rPr>
                             </w:pPr>
                             <w:proofErr w:type="spellStart"/>
@@ -5946,8 +5950,8 @@
                                 <w:rFonts w:ascii="Arial Black" w:hAnsi="Arial Black" w:cs="Aria Black"/>
                                 <w:b/>
                                 <w:bCs/>
-                                <w:sz w:val="14"/>
-                                <w:szCs w:val="14"/>
+                                <w:sz w:val="12"/>
+                                <w:szCs w:val="12"/>
                               </w:rPr>
                               <w:t>body_id</w:t>
                             </w:r>
@@ -6034,8 +6038,8 @@
                                       <w:rFonts w:ascii="Arial Black" w:hAnsi="Arial Black" w:cs="Aria Black"/>
                                       <w:b/>
                                       <w:bCs/>
-                                      <w:sz w:val="14"/>
-                                      <w:szCs w:val="14"/>
+                                      <w:sz w:val="12"/>
+                                      <w:szCs w:val="12"/>
                                     </w:rPr>
                                   </w:pPr>
                                   <w:proofErr w:type="spellStart"/>
@@ -6044,8 +6048,8 @@
                                       <w:rFonts w:ascii="Arial Black" w:hAnsi="Arial Black" w:cs="Aria Black"/>
                                       <w:b/>
                                       <w:bCs/>
-                                      <w:sz w:val="14"/>
-                                      <w:szCs w:val="14"/>
+                                      <w:sz w:val="12"/>
+                                      <w:szCs w:val="12"/>
                                     </w:rPr>
                                     <w:t>motor_id</w:t>
                                   </w:r>
@@ -6083,8 +6087,8 @@
                                 <w:rFonts w:ascii="Arial Black" w:hAnsi="Arial Black" w:cs="Aria Black"/>
                                 <w:b/>
                                 <w:bCs/>
-                                <w:sz w:val="14"/>
-                                <w:szCs w:val="14"/>
+                                <w:sz w:val="12"/>
+                                <w:szCs w:val="12"/>
                               </w:rPr>
                             </w:pPr>
                             <w:proofErr w:type="spellStart"/>
@@ -6093,8 +6097,8 @@
                                 <w:rFonts w:ascii="Arial Black" w:hAnsi="Arial Black" w:cs="Aria Black"/>
                                 <w:b/>
                                 <w:bCs/>
-                                <w:sz w:val="14"/>
-                                <w:szCs w:val="14"/>
+                                <w:sz w:val="12"/>
+                                <w:szCs w:val="12"/>
                               </w:rPr>
                               <w:t>motor_id</w:t>
                             </w:r>
@@ -6181,8 +6185,8 @@
                                       <w:rFonts w:ascii="Arial Black" w:hAnsi="Arial Black" w:cs="Aria Black"/>
                                       <w:b/>
                                       <w:bCs/>
-                                      <w:sz w:val="16"/>
-                                      <w:szCs w:val="16"/>
+                                      <w:sz w:val="14"/>
+                                      <w:szCs w:val="14"/>
                                     </w:rPr>
                                   </w:pPr>
                                   <w:proofErr w:type="spellStart"/>
@@ -6191,8 +6195,8 @@
                                       <w:rFonts w:ascii="Arial Black" w:hAnsi="Arial Black" w:cs="Aria Black"/>
                                       <w:b/>
                                       <w:bCs/>
-                                      <w:sz w:val="16"/>
-                                      <w:szCs w:val="16"/>
+                                      <w:sz w:val="14"/>
+                                      <w:szCs w:val="14"/>
                                     </w:rPr>
                                     <w:t>pelak</w:t>
                                   </w:r>
@@ -6230,8 +6234,8 @@
                                 <w:rFonts w:ascii="Arial Black" w:hAnsi="Arial Black" w:cs="Aria Black"/>
                                 <w:b/>
                                 <w:bCs/>
-                                <w:sz w:val="16"/>
-                                <w:szCs w:val="16"/>
+                                <w:sz w:val="14"/>
+                                <w:szCs w:val="14"/>
                               </w:rPr>
                             </w:pPr>
                             <w:proofErr w:type="spellStart"/>
@@ -6240,8 +6244,8 @@
                                 <w:rFonts w:ascii="Arial Black" w:hAnsi="Arial Black" w:cs="Aria Black"/>
                                 <w:b/>
                                 <w:bCs/>
-                                <w:sz w:val="16"/>
-                                <w:szCs w:val="16"/>
+                                <w:sz w:val="14"/>
+                                <w:szCs w:val="14"/>
                               </w:rPr>
                               <w:t>pelak</w:t>
                             </w:r>
@@ -6327,8 +6331,8 @@
                                       <w:rFonts w:ascii="Arial Black" w:hAnsi="Arial Black" w:cs="Aria Black"/>
                                       <w:b/>
                                       <w:bCs/>
-                                      <w:sz w:val="16"/>
-                                      <w:szCs w:val="16"/>
+                                      <w:sz w:val="12"/>
+                                      <w:szCs w:val="12"/>
                                     </w:rPr>
                                   </w:pPr>
                                   <w:proofErr w:type="spellStart"/>
@@ -6337,8 +6341,8 @@
                                       <w:rFonts w:ascii="Arial Black" w:hAnsi="Arial Black" w:cs="Aria Black"/>
                                       <w:b/>
                                       <w:bCs/>
-                                      <w:sz w:val="16"/>
-                                      <w:szCs w:val="16"/>
+                                      <w:sz w:val="12"/>
+                                      <w:szCs w:val="12"/>
                                     </w:rPr>
                                     <w:t>car_model</w:t>
                                   </w:r>
@@ -6375,8 +6379,8 @@
                                 <w:rFonts w:ascii="Arial Black" w:hAnsi="Arial Black" w:cs="Aria Black"/>
                                 <w:b/>
                                 <w:bCs/>
-                                <w:sz w:val="16"/>
-                                <w:szCs w:val="16"/>
+                                <w:sz w:val="12"/>
+                                <w:szCs w:val="12"/>
                               </w:rPr>
                             </w:pPr>
                             <w:proofErr w:type="spellStart"/>
@@ -6385,8 +6389,8 @@
                                 <w:rFonts w:ascii="Arial Black" w:hAnsi="Arial Black" w:cs="Aria Black"/>
                                 <w:b/>
                                 <w:bCs/>
-                                <w:sz w:val="16"/>
-                                <w:szCs w:val="16"/>
+                                <w:sz w:val="12"/>
+                                <w:szCs w:val="12"/>
                               </w:rPr>
                               <w:t>car_model</w:t>
                             </w:r>
@@ -6620,8 +6624,8 @@
                                       <w:rFonts w:ascii="Arial Black" w:hAnsi="Arial Black" w:cs="Aria Black"/>
                                       <w:b/>
                                       <w:bCs/>
-                                      <w:sz w:val="14"/>
-                                      <w:szCs w:val="14"/>
+                                      <w:sz w:val="12"/>
+                                      <w:szCs w:val="12"/>
                                     </w:rPr>
                                   </w:pPr>
                                   <w:proofErr w:type="spellStart"/>
@@ -6630,8 +6634,8 @@
                                       <w:rFonts w:ascii="Arial Black" w:hAnsi="Arial Black" w:cs="Aria Black"/>
                                       <w:b/>
                                       <w:bCs/>
-                                      <w:sz w:val="14"/>
-                                      <w:szCs w:val="14"/>
+                                      <w:sz w:val="12"/>
+                                      <w:szCs w:val="12"/>
                                     </w:rPr>
                                     <w:t>car_color</w:t>
                                   </w:r>
@@ -6669,8 +6673,8 @@
                                 <w:rFonts w:ascii="Arial Black" w:hAnsi="Arial Black" w:cs="Aria Black"/>
                                 <w:b/>
                                 <w:bCs/>
-                                <w:sz w:val="14"/>
-                                <w:szCs w:val="14"/>
+                                <w:sz w:val="12"/>
+                                <w:szCs w:val="12"/>
                               </w:rPr>
                             </w:pPr>
                             <w:proofErr w:type="spellStart"/>
@@ -6679,8 +6683,8 @@
                                 <w:rFonts w:ascii="Arial Black" w:hAnsi="Arial Black" w:cs="Aria Black"/>
                                 <w:b/>
                                 <w:bCs/>
-                                <w:sz w:val="14"/>
-                                <w:szCs w:val="14"/>
+                                <w:sz w:val="12"/>
+                                <w:szCs w:val="12"/>
                               </w:rPr>
                               <w:t>car_color</w:t>
                             </w:r>
@@ -6767,8 +6771,8 @@
                                       <w:rFonts w:ascii="Arial Black" w:hAnsi="Arial Black" w:cs="Aria Black"/>
                                       <w:b/>
                                       <w:bCs/>
-                                      <w:sz w:val="14"/>
-                                      <w:szCs w:val="14"/>
+                                      <w:sz w:val="12"/>
+                                      <w:szCs w:val="12"/>
                                     </w:rPr>
                                   </w:pPr>
                                   <w:proofErr w:type="spellStart"/>
@@ -6777,8 +6781,8 @@
                                       <w:rFonts w:ascii="Arial Black" w:hAnsi="Arial Black" w:cs="Aria Black"/>
                                       <w:b/>
                                       <w:bCs/>
-                                      <w:sz w:val="14"/>
-                                      <w:szCs w:val="14"/>
+                                      <w:sz w:val="12"/>
+                                      <w:szCs w:val="12"/>
                                     </w:rPr>
                                     <w:t>car_type</w:t>
                                   </w:r>
@@ -6816,8 +6820,8 @@
                                 <w:rFonts w:ascii="Arial Black" w:hAnsi="Arial Black" w:cs="Aria Black"/>
                                 <w:b/>
                                 <w:bCs/>
-                                <w:sz w:val="14"/>
-                                <w:szCs w:val="14"/>
+                                <w:sz w:val="12"/>
+                                <w:szCs w:val="12"/>
                               </w:rPr>
                             </w:pPr>
                             <w:proofErr w:type="spellStart"/>
@@ -6826,8 +6830,8 @@
                                 <w:rFonts w:ascii="Arial Black" w:hAnsi="Arial Black" w:cs="Aria Black"/>
                                 <w:b/>
                                 <w:bCs/>
-                                <w:sz w:val="14"/>
-                                <w:szCs w:val="14"/>
+                                <w:sz w:val="12"/>
+                                <w:szCs w:val="12"/>
                               </w:rPr>
                               <w:t>car_type</w:t>
                             </w:r>
@@ -7983,8 +7987,8 @@
                                 <w:rFonts w:ascii="Arial Black" w:hAnsi="Arial Black" w:cs="Aria Black"/>
                                 <w:b/>
                                 <w:bCs/>
-                                <w:sz w:val="14"/>
-                                <w:szCs w:val="12"/>
+                                <w:sz w:val="12"/>
+                                <w:szCs w:val="10"/>
                                 <w:rtl/>
                                 <w:lang w:bidi="fa-IR"/>
                               </w:rPr>
@@ -7995,8 +7999,8 @@
                                 <w:rFonts w:ascii="Arial Black" w:hAnsi="Arial Black" w:cs="Aria Black"/>
                                 <w:b/>
                                 <w:bCs/>
-                                <w:sz w:val="14"/>
-                                <w:szCs w:val="12"/>
+                                <w:sz w:val="12"/>
+                                <w:szCs w:val="10"/>
                                 <w:lang w:bidi="fa-IR"/>
                               </w:rPr>
                               <w:t>deal_date</w:t>
@@ -8035,8 +8039,8 @@
                           <w:rFonts w:ascii="Arial Black" w:hAnsi="Arial Black" w:cs="Aria Black"/>
                           <w:b/>
                           <w:bCs/>
-                          <w:sz w:val="14"/>
-                          <w:szCs w:val="12"/>
+                          <w:sz w:val="12"/>
+                          <w:szCs w:val="10"/>
                           <w:rtl/>
                           <w:lang w:bidi="fa-IR"/>
                         </w:rPr>
@@ -8047,8 +8051,8 @@
                           <w:rFonts w:ascii="Arial Black" w:hAnsi="Arial Black" w:cs="Aria Black"/>
                           <w:b/>
                           <w:bCs/>
-                          <w:sz w:val="14"/>
-                          <w:szCs w:val="12"/>
+                          <w:sz w:val="12"/>
+                          <w:szCs w:val="10"/>
                           <w:lang w:bidi="fa-IR"/>
                         </w:rPr>
                         <w:t>deal_date</w:t>
@@ -8117,8 +8121,8 @@
                                 <w:rFonts w:ascii="Arial Black" w:hAnsi="Arial Black" w:cs="Aria Black"/>
                                 <w:b/>
                                 <w:bCs/>
-                                <w:sz w:val="14"/>
-                                <w:szCs w:val="14"/>
+                                <w:sz w:val="12"/>
+                                <w:szCs w:val="12"/>
                               </w:rPr>
                             </w:pPr>
                             <w:proofErr w:type="spellStart"/>
@@ -8127,8 +8131,8 @@
                                 <w:rFonts w:ascii="Arial Black" w:hAnsi="Arial Black" w:cs="Aria Black"/>
                                 <w:b/>
                                 <w:bCs/>
-                                <w:sz w:val="14"/>
-                                <w:szCs w:val="14"/>
+                                <w:sz w:val="12"/>
+                                <w:szCs w:val="12"/>
                               </w:rPr>
                               <w:t>d</w:t>
                             </w:r>
@@ -8137,8 +8141,8 @@
                                 <w:rFonts w:ascii="Arial Black" w:hAnsi="Arial Black" w:cs="Aria Black"/>
                                 <w:b/>
                                 <w:bCs/>
-                                <w:sz w:val="14"/>
-                                <w:szCs w:val="14"/>
+                                <w:sz w:val="12"/>
+                                <w:szCs w:val="12"/>
                               </w:rPr>
                               <w:t>ay_respite</w:t>
                             </w:r>
@@ -8176,8 +8180,8 @@
                           <w:rFonts w:ascii="Arial Black" w:hAnsi="Arial Black" w:cs="Aria Black"/>
                           <w:b/>
                           <w:bCs/>
-                          <w:sz w:val="14"/>
-                          <w:szCs w:val="14"/>
+                          <w:sz w:val="12"/>
+                          <w:szCs w:val="12"/>
                         </w:rPr>
                       </w:pPr>
                       <w:proofErr w:type="spellStart"/>
@@ -8186,8 +8190,8 @@
                           <w:rFonts w:ascii="Arial Black" w:hAnsi="Arial Black" w:cs="Aria Black"/>
                           <w:b/>
                           <w:bCs/>
-                          <w:sz w:val="14"/>
-                          <w:szCs w:val="14"/>
+                          <w:sz w:val="12"/>
+                          <w:szCs w:val="12"/>
                         </w:rPr>
                         <w:t>d</w:t>
                       </w:r>
@@ -8196,8 +8200,8 @@
                           <w:rFonts w:ascii="Arial Black" w:hAnsi="Arial Black" w:cs="Aria Black"/>
                           <w:b/>
                           <w:bCs/>
-                          <w:sz w:val="14"/>
-                          <w:szCs w:val="14"/>
+                          <w:sz w:val="12"/>
+                          <w:szCs w:val="12"/>
                         </w:rPr>
                         <w:t>ay_respite</w:t>
                       </w:r>
@@ -8265,8 +8269,8 @@
                                 <w:rFonts w:ascii="Arial Black" w:hAnsi="Arial Black" w:cs="Aria Black"/>
                                 <w:b/>
                                 <w:bCs/>
-                                <w:sz w:val="14"/>
-                                <w:szCs w:val="14"/>
+                                <w:sz w:val="12"/>
+                                <w:szCs w:val="12"/>
                                 <w:rtl/>
                                 <w:lang w:bidi="fa-IR"/>
                               </w:rPr>
@@ -8277,8 +8281,8 @@
                                 <w:rFonts w:ascii="Arial Black" w:hAnsi="Arial Black" w:cs="Aria Black"/>
                                 <w:b/>
                                 <w:bCs/>
-                                <w:sz w:val="14"/>
-                                <w:szCs w:val="14"/>
+                                <w:sz w:val="12"/>
+                                <w:szCs w:val="12"/>
                                 <w:lang w:bidi="fa-IR"/>
                               </w:rPr>
                               <w:t>deal_time</w:t>
@@ -8317,8 +8321,8 @@
                           <w:rFonts w:ascii="Arial Black" w:hAnsi="Arial Black" w:cs="Aria Black"/>
                           <w:b/>
                           <w:bCs/>
-                          <w:sz w:val="14"/>
-                          <w:szCs w:val="14"/>
+                          <w:sz w:val="12"/>
+                          <w:szCs w:val="12"/>
                           <w:rtl/>
                           <w:lang w:bidi="fa-IR"/>
                         </w:rPr>
@@ -8329,8 +8333,8 @@
                           <w:rFonts w:ascii="Arial Black" w:hAnsi="Arial Black" w:cs="Aria Black"/>
                           <w:b/>
                           <w:bCs/>
-                          <w:sz w:val="14"/>
-                          <w:szCs w:val="14"/>
+                          <w:sz w:val="12"/>
+                          <w:szCs w:val="12"/>
                           <w:lang w:bidi="fa-IR"/>
                         </w:rPr>
                         <w:t>deal_time</w:t>
@@ -8399,8 +8403,8 @@
                               <w:rPr>
                                 <w:rFonts w:ascii="Arial Black" w:hAnsi="Arial Black" w:cs="Aria Black"/>
                                 <w:bCs/>
-                                <w:sz w:val="14"/>
-                                <w:szCs w:val="14"/>
+                                <w:sz w:val="12"/>
+                                <w:szCs w:val="12"/>
                                 <w:lang w:bidi="fa-IR"/>
                               </w:rPr>
                             </w:pPr>
@@ -8409,8 +8413,8 @@
                               <w:rPr>
                                 <w:rFonts w:ascii="Arial Black" w:hAnsi="Arial Black" w:cs="Aria Black"/>
                                 <w:bCs/>
-                                <w:sz w:val="14"/>
-                                <w:szCs w:val="14"/>
+                                <w:sz w:val="12"/>
+                                <w:szCs w:val="12"/>
                                 <w:lang w:bidi="fa-IR"/>
                               </w:rPr>
                               <w:t>car_kilometer</w:t>
@@ -8449,8 +8453,8 @@
                         <w:rPr>
                           <w:rFonts w:ascii="Arial Black" w:hAnsi="Arial Black" w:cs="Aria Black"/>
                           <w:bCs/>
-                          <w:sz w:val="14"/>
-                          <w:szCs w:val="14"/>
+                          <w:sz w:val="12"/>
+                          <w:szCs w:val="12"/>
                           <w:lang w:bidi="fa-IR"/>
                         </w:rPr>
                       </w:pPr>
@@ -8459,8 +8463,8 @@
                         <w:rPr>
                           <w:rFonts w:ascii="Arial Black" w:hAnsi="Arial Black" w:cs="Aria Black"/>
                           <w:bCs/>
-                          <w:sz w:val="14"/>
-                          <w:szCs w:val="14"/>
+                          <w:sz w:val="12"/>
+                          <w:szCs w:val="12"/>
                           <w:lang w:bidi="fa-IR"/>
                         </w:rPr>
                         <w:t>car_kilometer</w:t>
@@ -8529,8 +8533,8 @@
                                 <w:rFonts w:ascii="Arial Black" w:hAnsi="Arial Black" w:cs="Aria Black"/>
                                 <w:b/>
                                 <w:bCs/>
-                                <w:sz w:val="14"/>
-                                <w:szCs w:val="14"/>
+                                <w:sz w:val="12"/>
+                                <w:szCs w:val="12"/>
                                 <w:rtl/>
                                 <w:lang w:bidi="fa-IR"/>
                               </w:rPr>
@@ -8541,8 +8545,8 @@
                                 <w:rFonts w:ascii="Arial Black" w:hAnsi="Arial Black" w:cs="Aria Black"/>
                                 <w:b/>
                                 <w:bCs/>
-                                <w:sz w:val="14"/>
-                                <w:szCs w:val="14"/>
+                                <w:sz w:val="12"/>
+                                <w:szCs w:val="12"/>
                                 <w:lang w:bidi="fa-IR"/>
                               </w:rPr>
                               <w:t>deal_date</w:t>
@@ -8581,8 +8585,8 @@
                           <w:rFonts w:ascii="Arial Black" w:hAnsi="Arial Black" w:cs="Aria Black"/>
                           <w:b/>
                           <w:bCs/>
-                          <w:sz w:val="14"/>
-                          <w:szCs w:val="14"/>
+                          <w:sz w:val="12"/>
+                          <w:szCs w:val="12"/>
                           <w:rtl/>
                           <w:lang w:bidi="fa-IR"/>
                         </w:rPr>
@@ -8593,8 +8597,8 @@
                           <w:rFonts w:ascii="Arial Black" w:hAnsi="Arial Black" w:cs="Aria Black"/>
                           <w:b/>
                           <w:bCs/>
-                          <w:sz w:val="14"/>
-                          <w:szCs w:val="14"/>
+                          <w:sz w:val="12"/>
+                          <w:szCs w:val="12"/>
                           <w:lang w:bidi="fa-IR"/>
                         </w:rPr>
                         <w:t>deal_date</w:t>
@@ -9250,8 +9254,8 @@
                                 <w:rFonts w:ascii="Arial Black" w:hAnsi="Arial Black" w:cs="Aria Black"/>
                                 <w:b/>
                                 <w:bCs/>
-                                <w:sz w:val="16"/>
-                                <w:szCs w:val="20"/>
+                                <w:sz w:val="14"/>
+                                <w:szCs w:val="18"/>
                               </w:rPr>
                             </w:pPr>
                             <w:proofErr w:type="spellStart"/>
@@ -9260,8 +9264,8 @@
                                 <w:rFonts w:ascii="Arial Black" w:hAnsi="Arial Black" w:cs="Aria Black"/>
                                 <w:b/>
                                 <w:bCs/>
-                                <w:sz w:val="16"/>
-                                <w:szCs w:val="20"/>
+                                <w:sz w:val="14"/>
+                                <w:szCs w:val="18"/>
                               </w:rPr>
                               <w:t>s</w:t>
                             </w:r>
@@ -9270,8 +9274,8 @@
                                 <w:rFonts w:ascii="Arial Black" w:hAnsi="Arial Black" w:cs="Aria Black"/>
                                 <w:b/>
                                 <w:bCs/>
-                                <w:sz w:val="16"/>
-                                <w:szCs w:val="20"/>
+                                <w:sz w:val="14"/>
+                                <w:szCs w:val="18"/>
                               </w:rPr>
                               <w:t>eller_</w:t>
                             </w:r>
@@ -9280,8 +9284,8 @@
                                 <w:rFonts w:ascii="Arial Black" w:hAnsi="Arial Black" w:cs="Aria Black"/>
                                 <w:b/>
                                 <w:bCs/>
-                                <w:sz w:val="16"/>
-                                <w:szCs w:val="20"/>
+                                <w:sz w:val="14"/>
+                                <w:szCs w:val="18"/>
                               </w:rPr>
                               <w:t>f</w:t>
                             </w:r>
@@ -9290,8 +9294,8 @@
                                 <w:rFonts w:ascii="Arial Black" w:hAnsi="Arial Black" w:cs="Aria Black"/>
                                 <w:b/>
                                 <w:bCs/>
-                                <w:sz w:val="16"/>
-                                <w:szCs w:val="20"/>
+                                <w:sz w:val="14"/>
+                                <w:szCs w:val="18"/>
                               </w:rPr>
                               <w:t>n</w:t>
                             </w:r>
@@ -9300,8 +9304,8 @@
                                 <w:rFonts w:ascii="Arial Black" w:hAnsi="Arial Black" w:cs="Aria Black"/>
                                 <w:b/>
                                 <w:bCs/>
-                                <w:sz w:val="16"/>
-                                <w:szCs w:val="20"/>
+                                <w:sz w:val="14"/>
+                                <w:szCs w:val="18"/>
                               </w:rPr>
                               <w:t>ame</w:t>
                             </w:r>
@@ -9339,8 +9343,8 @@
                           <w:rFonts w:ascii="Arial Black" w:hAnsi="Arial Black" w:cs="Aria Black"/>
                           <w:b/>
                           <w:bCs/>
-                          <w:sz w:val="16"/>
-                          <w:szCs w:val="20"/>
+                          <w:sz w:val="14"/>
+                          <w:szCs w:val="18"/>
                         </w:rPr>
                       </w:pPr>
                       <w:proofErr w:type="spellStart"/>
@@ -9349,8 +9353,8 @@
                           <w:rFonts w:ascii="Arial Black" w:hAnsi="Arial Black" w:cs="Aria Black"/>
                           <w:b/>
                           <w:bCs/>
-                          <w:sz w:val="16"/>
-                          <w:szCs w:val="20"/>
+                          <w:sz w:val="14"/>
+                          <w:szCs w:val="18"/>
                         </w:rPr>
                         <w:t>s</w:t>
                       </w:r>
@@ -9359,8 +9363,8 @@
                           <w:rFonts w:ascii="Arial Black" w:hAnsi="Arial Black" w:cs="Aria Black"/>
                           <w:b/>
                           <w:bCs/>
-                          <w:sz w:val="16"/>
-                          <w:szCs w:val="20"/>
+                          <w:sz w:val="14"/>
+                          <w:szCs w:val="18"/>
                         </w:rPr>
                         <w:t>eller_</w:t>
                       </w:r>
@@ -9369,8 +9373,8 @@
                           <w:rFonts w:ascii="Arial Black" w:hAnsi="Arial Black" w:cs="Aria Black"/>
                           <w:b/>
                           <w:bCs/>
-                          <w:sz w:val="16"/>
-                          <w:szCs w:val="20"/>
+                          <w:sz w:val="14"/>
+                          <w:szCs w:val="18"/>
                         </w:rPr>
                         <w:t>f</w:t>
                       </w:r>
@@ -9379,8 +9383,8 @@
                           <w:rFonts w:ascii="Arial Black" w:hAnsi="Arial Black" w:cs="Aria Black"/>
                           <w:b/>
                           <w:bCs/>
-                          <w:sz w:val="16"/>
-                          <w:szCs w:val="20"/>
+                          <w:sz w:val="14"/>
+                          <w:szCs w:val="18"/>
                         </w:rPr>
                         <w:t>n</w:t>
                       </w:r>
@@ -9389,8 +9393,8 @@
                           <w:rFonts w:ascii="Arial Black" w:hAnsi="Arial Black" w:cs="Aria Black"/>
                           <w:b/>
                           <w:bCs/>
-                          <w:sz w:val="16"/>
-                          <w:szCs w:val="20"/>
+                          <w:sz w:val="14"/>
+                          <w:szCs w:val="18"/>
                         </w:rPr>
                         <w:t>ame</w:t>
                       </w:r>

</xml_diff>